<commit_message>
Revision de trabajos pendientes y realizacion de actividad sobre metodologias de investigacion y de desarrollo de software
</commit_message>
<xml_diff>
--- a/colorimetria.docx
+++ b/colorimetria.docx
@@ -259,44 +259,13 @@
       </w:r>
     </w:p>
     <w:p>
-      <w:pPr>
-        <w:rPr>
-          <w:lang w:val="en-US"/>
-        </w:rPr>
-      </w:pPr>
-      <w:r>
-        <w:rPr>
-          <w:lang w:val="en-US"/>
-        </w:rPr>
-        <w:t xml:space="preserve">Commit 3 </w:t>
-      </w:r>
-      <w:proofErr w:type="spellStart"/>
-      <w:r>
-        <w:rPr>
-          <w:lang w:val="en-US"/>
-        </w:rPr>
-        <w:t>segunda</w:t>
-      </w:r>
-      <w:proofErr w:type="spellEnd"/>
-      <w:r>
-        <w:rPr>
-          <w:lang w:val="en-US"/>
-        </w:rPr>
-        <w:t xml:space="preserve"> </w:t>
-      </w:r>
-      <w:proofErr w:type="spellStart"/>
-      <w:r>
-        <w:rPr>
-          <w:lang w:val="en-US"/>
-        </w:rPr>
-        <w:t>semana</w:t>
-      </w:r>
-      <w:proofErr w:type="spellEnd"/>
-      <w:r>
-        <w:rPr>
-          <w:lang w:val="en-US"/>
-        </w:rPr>
-        <w:t xml:space="preserve"> </w:t>
+      <w:proofErr w:type="spellStart"/>
+      <w:r>
+        <w:t>Commit</w:t>
+      </w:r>
+      <w:proofErr w:type="spellEnd"/>
+      <w:r>
+        <w:t xml:space="preserve"> 3 segunda semana </w:t>
       </w:r>
     </w:p>
     <w:p>
@@ -305,6 +274,37 @@
       </w:r>
       <w:r>
         <w:t xml:space="preserve">emana y por fin empezar a realizar el proyecto en el ámbito de programación que será lo complicado se analizaron las fortalezas del proyecto e igualmente se solicitó que pidiéramos los nombres de los otros proyectos para buscar cosas débiles en los análisis de los otros equipos y poder tumbarles el proyecto, era una práctica muy interesante aunque por causas de tiempo no se pudo realizar. </w:t>
+      </w:r>
+    </w:p>
+    <w:p>
+      <w:proofErr w:type="spellStart"/>
+      <w:r>
+        <w:t>Commit</w:t>
+      </w:r>
+      <w:proofErr w:type="spellEnd"/>
+      <w:r>
+        <w:t xml:space="preserve"> 1 tercera semana </w:t>
+      </w:r>
+    </w:p>
+    <w:p>
+      <w:r>
+        <w:t xml:space="preserve">La tercera semana se </w:t>
+      </w:r>
+      <w:proofErr w:type="spellStart"/>
+      <w:r>
+        <w:t>conformo</w:t>
+      </w:r>
+      <w:proofErr w:type="spellEnd"/>
+      <w:r>
+        <w:t xml:space="preserve"> primero en seguir revisando lo que </w:t>
+      </w:r>
+      <w:proofErr w:type="spellStart"/>
+      <w:r>
+        <w:t>serian</w:t>
+      </w:r>
+      <w:proofErr w:type="spellEnd"/>
+      <w:r>
+        <w:t xml:space="preserve"> los ejercicios de la semana pasada, y se propuso una actividad individual-equipo done veíamos las diferentes metodologías que son la de investigación y las de desarrollo de software.</w:t>
       </w:r>
       <w:bookmarkStart w:id="0" w:name="_GoBack"/>
       <w:bookmarkEnd w:id="0"/>

</xml_diff>

<commit_message>
realizacion de la actividad conociendo tambien las diferentes perspectivas cualitativa y cuantitativa enfocadas en nuestro proyecto e igualmente realizando la actividad siguiente conociendo lo que es el metodo SCRUM y permitiendo conocer otras definiciones de ello
</commit_message>
<xml_diff>
--- a/colorimetria.docx
+++ b/colorimetria.docx
@@ -305,6 +305,55 @@
       <w:proofErr w:type="spellEnd"/>
       <w:r>
         <w:t xml:space="preserve"> los ejercicios de la semana pasada, y se propuso una actividad individual-equipo done veíamos las diferentes metodologías que son la de investigación y las de desarrollo de software.</w:t>
+      </w:r>
+    </w:p>
+    <w:p>
+      <w:proofErr w:type="spellStart"/>
+      <w:r>
+        <w:t>Commit</w:t>
+      </w:r>
+      <w:proofErr w:type="spellEnd"/>
+      <w:r>
+        <w:t xml:space="preserve"> 2 </w:t>
+      </w:r>
+    </w:p>
+    <w:p>
+      <w:r>
+        <w:t xml:space="preserve">Posteriormente después de la clase se siguió realizando la actividad ya que no nos </w:t>
+      </w:r>
+      <w:proofErr w:type="spellStart"/>
+      <w:r>
+        <w:t>alcanzo</w:t>
+      </w:r>
+      <w:proofErr w:type="spellEnd"/>
+      <w:r>
+        <w:t xml:space="preserve"> el tiempo </w:t>
+      </w:r>
+      <w:proofErr w:type="spellStart"/>
+      <w:proofErr w:type="gramStart"/>
+      <w:r>
+        <w:t>mas</w:t>
+      </w:r>
+      <w:proofErr w:type="spellEnd"/>
+      <w:proofErr w:type="gramEnd"/>
+      <w:r>
+        <w:t xml:space="preserve"> que para terminar de explicar todo lo necesario para su realización, </w:t>
+      </w:r>
+      <w:proofErr w:type="spellStart"/>
+      <w:r>
+        <w:t>tmb</w:t>
+      </w:r>
+      <w:proofErr w:type="spellEnd"/>
+      <w:r>
+        <w:t xml:space="preserve"> se vieron las perspectivas que </w:t>
+      </w:r>
+      <w:proofErr w:type="spellStart"/>
+      <w:r>
+        <w:t>serian</w:t>
+      </w:r>
+      <w:proofErr w:type="spellEnd"/>
+      <w:r>
+        <w:t xml:space="preserve"> la cuantitativa y la cualitativa. </w:t>
       </w:r>
       <w:bookmarkStart w:id="0" w:name="_GoBack"/>
       <w:bookmarkEnd w:id="0"/>

</xml_diff>

<commit_message>
responder la pregunta que se planteo en clase sobre que debilidades tiene nuestro proyecto que nos impida utilizar las oportunidades analizadas previamente en otra actividad, se espera que la siguiente semana empezemos a realizar nuestro proyecto ya con codigo etc.
</commit_message>
<xml_diff>
--- a/colorimetria.docx
+++ b/colorimetria.docx
@@ -354,6 +354,29 @@
       <w:proofErr w:type="spellEnd"/>
       <w:r>
         <w:t xml:space="preserve"> la cuantitativa y la cualitativa. </w:t>
+      </w:r>
+    </w:p>
+    <w:p>
+      <w:proofErr w:type="spellStart"/>
+      <w:r>
+        <w:t>Commit</w:t>
+      </w:r>
+      <w:proofErr w:type="spellEnd"/>
+      <w:r>
+        <w:t xml:space="preserve"> 3 </w:t>
+      </w:r>
+    </w:p>
+    <w:p>
+      <w:r>
+        <w:t xml:space="preserve">En el segundo </w:t>
+      </w:r>
+      <w:proofErr w:type="spellStart"/>
+      <w:r>
+        <w:t>dia</w:t>
+      </w:r>
+      <w:proofErr w:type="spellEnd"/>
+      <w:r>
+        <w:t xml:space="preserve"> de teoría nos pusieron a resolver una pregunta que era conocer que debilidades tenia nuestro proyecto que a la vez nos impida usas las oportunidades que previamente consolidamos en otra actividad anterior. </w:t>
       </w:r>
       <w:bookmarkStart w:id="0" w:name="_GoBack"/>
       <w:bookmarkEnd w:id="0"/>

</xml_diff>